<commit_message>
Actualizar documento de trabajo WEB DE CONSULTOR RIGGA 360.docx
Co-Authored-By: Claude Opus 5.5 <noreply@anthropic.com>
</commit_message>
<xml_diff>
--- a/Creacion de web _06/WEB DE CONSULTOR RIGGA 360.docx
+++ b/Creacion de web _06/WEB DE CONSULTOR RIGGA 360.docx
@@ -7,8 +7,6 @@
         <w:t>WEB DE CONSILTOR RIGGA 360</w:t>
       </w:r>
     </w:p>
-    <w:p/>
-    <w:p/>
     <w:p>
       <w:hyperlink r:id="rId5" w:history="1">
         <w:r>
@@ -19,6 +17,26 @@
         </w:r>
       </w:hyperlink>
     </w:p>
+    <w:p>
+      <w:r>
+        <w:rPr>
+          <w:highlight w:val="green"/>
+        </w:rPr>
+        <w:t>NUEVA PÁGINA WEB ACTUALIZADA RIGGA 360 CONSULTORES</w:t>
+      </w:r>
+    </w:p>
+    <w:p>
+      <w:hyperlink r:id="rId6" w:history="1">
+        <w:r>
+          <w:rPr>
+            <w:rStyle w:val="Hipervnculo"/>
+            <w:highlight w:val="yellow"/>
+          </w:rPr>
+          <w:t>https://rigga360consultores.netlify.app</w:t>
+        </w:r>
+      </w:hyperlink>
+    </w:p>
+    <w:p/>
     <w:p/>
     <w:p/>
     <w:sectPr>

</xml_diff>